<commit_message>
quick patch for v0.4.5
</commit_message>
<xml_diff>
--- a/PATCH_NOTES_v0.4.5.docx
+++ b/PATCH_NOTES_v0.4.5.docx
@@ -561,6 +561,37 @@
       <w:pPr>
         <w:pStyle w:val="ListParagraph"/>
         <w:numPr>
+          <w:ilvl w:val="1"/>
+          <w:numId w:val="2"/>
+        </w:numPr>
+      </w:pPr>
+      <w:r>
+        <w:rPr>
+          <w:b/>
+          <w:bCs/>
+        </w:rPr>
+        <w:t xml:space="preserve">Redone in the quick patch:</w:t>
+      </w:r>
+      <w:r>
+        <w:t xml:space="preserve"> it's live, animated fire now, one continuous wall all the way round the court. There's no repeating flame picture, and no glitching as it moves.</w:t>
+      </w:r>
+    </w:p>
+    <w:p>
+      <w:pPr>
+        <w:pStyle w:val="ListParagraph"/>
+        <w:numPr>
+          <w:ilvl w:val="1"/>
+          <w:numId w:val="2"/>
+        </w:numPr>
+      </w:pPr>
+      <w:r>
+        <w:t xml:space="preserve">It's about 1.4 m tall at 3 wins, 2.2 m at 6, 3 m at 9 and 3.8 m at 12, brighter and fuller at each step, and it grows smoothly.</w:t>
+      </w:r>
+    </w:p>
+    <w:p>
+      <w:pPr>
+        <w:pStyle w:val="ListParagraph"/>
+        <w:numPr>
           <w:ilvl w:val="0"/>
           <w:numId w:val="2"/>
         </w:numPr>
@@ -606,6 +637,128 @@
           <w:b/>
           <w:bCs/>
         </w:rPr>
+        <w:t xml:space="preserve">A new shot meter</w:t>
+      </w:r>
+      <w:r>
+        <w:t xml:space="preserve"> (quick patch): a slim bar beside your player, with your exact green window drawn on it.</w:t>
+      </w:r>
+    </w:p>
+    <w:p>
+      <w:pPr>
+        <w:pStyle w:val="ListParagraph"/>
+        <w:numPr>
+          <w:ilvl w:val="1"/>
+          <w:numId w:val="2"/>
+        </w:numPr>
+      </w:pPr>
+      <w:r>
+        <w:t xml:space="preserve">Let go anywhere inside the window and it's an Excellent release; anywhere outside, it isn't. It uses the same numbers that grade the release, contest included, live.</w:t>
+      </w:r>
+    </w:p>
+    <w:p>
+      <w:pPr>
+        <w:pStyle w:val="ListParagraph"/>
+        <w:numPr>
+          <w:ilvl w:val="1"/>
+          <w:numId w:val="2"/>
+        </w:numPr>
+      </w:pPr>
+      <w:r>
+        <w:rPr>
+          <w:b/>
+          <w:bCs/>
+        </w:rPr>
+        <w:t xml:space="preserve">Solid green</w:t>
+      </w:r>
+      <w:r>
+        <w:t xml:space="preserve"> in the middle is the window your ratings give you on their own.</w:t>
+      </w:r>
+    </w:p>
+    <w:p>
+      <w:pPr>
+        <w:pStyle w:val="ListParagraph"/>
+        <w:numPr>
+          <w:ilvl w:val="1"/>
+          <w:numId w:val="2"/>
+        </w:numPr>
+      </w:pPr>
+      <w:r>
+        <w:rPr>
+          <w:b/>
+          <w:bCs/>
+        </w:rPr>
+        <w:t xml:space="preserve">Fading out to yellow</w:t>
+      </w:r>
+      <w:r>
+        <w:t xml:space="preserve"> is what your boosts add: badges, your Icon badge, a takeover, and a forgiving jumpshot base or layup package. A release in the yellow is still a green.</w:t>
+      </w:r>
+    </w:p>
+    <w:p>
+      <w:pPr>
+        <w:pStyle w:val="ListParagraph"/>
+        <w:numPr>
+          <w:ilvl w:val="1"/>
+          <w:numId w:val="2"/>
+        </w:numPr>
+      </w:pPr>
+      <w:r>
+        <w:rPr>
+          <w:b/>
+          <w:bCs/>
+        </w:rPr>
+        <w:t xml:space="preserve">Solid</w:t>
+      </w:r>
+      <w:r>
+        <w:t xml:space="preserve"> means a green always goes in (jumpers inside 35 feet, free throws). </w:t>
+      </w:r>
+      <w:r>
+        <w:rPr>
+          <w:b/>
+          <w:bCs/>
+        </w:rPr>
+        <w:t xml:space="preserve">Outlined</w:t>
+      </w:r>
+      <w:r>
+        <w:t xml:space="preserve"> means perfect timing but not an automatic make (layups, and shots from past 35 feet).</w:t>
+      </w:r>
+    </w:p>
+    <w:p>
+      <w:pPr>
+        <w:pStyle w:val="ListParagraph"/>
+        <w:numPr>
+          <w:ilvl w:val="1"/>
+          <w:numId w:val="2"/>
+        </w:numPr>
+      </w:pPr>
+      <w:r>
+        <w:t xml:space="preserve">No window when you're smothered (the bar turns red) or past half court. Close shots aren't timed, so they don't show a meter.</w:t>
+      </w:r>
+    </w:p>
+    <w:p>
+      <w:pPr>
+        <w:pStyle w:val="ListParagraph"/>
+        <w:numPr>
+          <w:ilvl w:val="1"/>
+          <w:numId w:val="2"/>
+        </w:numPr>
+      </w:pPr>
+      <w:r>
+        <w:t xml:space="preserve">After the shot, the bar freezes where you let go, colored by the grade. The Tab overlay has a legend.</w:t>
+      </w:r>
+    </w:p>
+    <w:p>
+      <w:pPr>
+        <w:pStyle w:val="ListParagraph"/>
+        <w:numPr>
+          <w:ilvl w:val="0"/>
+          <w:numId w:val="2"/>
+        </w:numPr>
+      </w:pPr>
+      <w:r>
+        <w:rPr>
+          <w:b/>
+          <w:bCs/>
+        </w:rPr>
         <w:t xml:space="preserve">Green windows are 10% smaller</w:t>
       </w:r>
       <w:r>
@@ -640,6 +793,25 @@
         </w:numPr>
       </w:pPr>
       <w:r>
+        <w:rPr>
+          <w:b/>
+          <w:bCs/>
+        </w:rPr>
+        <w:t xml:space="preserve">The attack button times layups too</w:t>
+      </w:r>
+      <w:r>
+        <w:t xml:space="preserve"> (quick patch). When a drive on Z, or with the right stick held down, can't be a dunk and turns into a layup, keep holding and let go at the top, the same as the shoot button. It used to be flipped up early every time.</w:t>
+      </w:r>
+    </w:p>
+    <w:p>
+      <w:pPr>
+        <w:pStyle w:val="ListParagraph"/>
+        <w:numPr>
+          <w:ilvl w:val="1"/>
+          <w:numId w:val="2"/>
+        </w:numPr>
+      </w:pPr>
+      <w:r>
         <w:t xml:space="preserve">Each layup package has its own timing: Scoop comes out early, then Basic, then Euro Step (after its long second step), and Finger Roll comes out late.</w:t>
       </w:r>
     </w:p>
@@ -835,6 +1007,91 @@
           <w:b/>
           <w:bCs/>
         </w:rPr>
+        <w:t xml:space="preserve">Deep shots are pure luck</w:t>
+      </w:r>
+      <w:r>
+        <w:t xml:space="preserve"> (quick patch):</w:t>
+      </w:r>
+    </w:p>
+    <w:p>
+      <w:pPr>
+        <w:pStyle w:val="ListParagraph"/>
+        <w:numPr>
+          <w:ilvl w:val="1"/>
+          <w:numId w:val="2"/>
+        </w:numPr>
+      </w:pPr>
+      <w:r>
+        <w:t xml:space="preserve">Past </w:t>
+      </w:r>
+      <w:r>
+        <w:rPr>
+          <w:b/>
+          <w:bCs/>
+        </w:rPr>
+        <w:t xml:space="preserve">35 feet</w:t>
+      </w:r>
+      <w:r>
+        <w:t xml:space="preserve">, the make chance falls off fast and the green window shrinks away. Limitless Range fades out with it, and a green that far out is no longer a sure make.</w:t>
+      </w:r>
+    </w:p>
+    <w:p>
+      <w:pPr>
+        <w:pStyle w:val="ListParagraph"/>
+        <w:numPr>
+          <w:ilvl w:val="1"/>
+          <w:numId w:val="2"/>
+        </w:numPr>
+      </w:pPr>
+      <w:r>
+        <w:t xml:space="preserve">Past the </w:t>
+      </w:r>
+      <w:r>
+        <w:rPr>
+          <w:b/>
+          <w:bCs/>
+        </w:rPr>
+        <w:t xml:space="preserve">half-court line</w:t>
+      </w:r>
+      <w:r>
+        <w:t xml:space="preserve">, every shot is </w:t>
+      </w:r>
+      <w:r>
+        <w:rPr>
+          <w:b/>
+          <w:bCs/>
+        </w:rPr>
+        <w:t xml:space="preserve">under 1%</w:t>
+      </w:r>
+      <w:r>
+        <w:t xml:space="preserve">, with no green window. Only a 99 three-point shooter reaches 1%; an 85 is at 0.7% and a 60 at 0.3%.</w:t>
+      </w:r>
+    </w:p>
+    <w:p>
+      <w:pPr>
+        <w:pStyle w:val="ListParagraph"/>
+        <w:numPr>
+          <w:ilvl w:val="1"/>
+          <w:numId w:val="2"/>
+        </w:numPr>
+      </w:pPr>
+      <w:r>
+        <w:t xml:space="preserve">A 99 three-point shooter with Hall of Fame Limitless Range at 38 feet: 15%, or 35% with a green. It used to be close to automatic.</w:t>
+      </w:r>
+    </w:p>
+    <w:p>
+      <w:pPr>
+        <w:pStyle w:val="ListParagraph"/>
+        <w:numPr>
+          <w:ilvl w:val="0"/>
+          <w:numId w:val="2"/>
+        </w:numPr>
+      </w:pPr>
+      <w:r>
+        <w:rPr>
+          <w:b/>
+          <w:bCs/>
+        </w:rPr>
         <w:t xml:space="preserve">Hot and cold:</w:t>
       </w:r>
     </w:p>
@@ -1260,6 +1517,100 @@
     </w:p>
     <w:p>
       <w:pPr>
+        <w:pStyle w:val="ListParagraph"/>
+        <w:numPr>
+          <w:ilvl w:val="0"/>
+          <w:numId w:val="2"/>
+        </w:numPr>
+      </w:pPr>
+      <w:r>
+        <w:rPr>
+          <w:b/>
+          <w:bCs/>
+        </w:rPr>
+        <w:t xml:space="preserve">Finishing follows your best rating</w:t>
+      </w:r>
+      <w:r>
+        <w:t xml:space="preserve"> (quick patch):</w:t>
+      </w:r>
+    </w:p>
+    <w:p>
+      <w:pPr>
+        <w:pStyle w:val="ListParagraph"/>
+        <w:numPr>
+          <w:ilvl w:val="1"/>
+          <w:numId w:val="2"/>
+        </w:numPr>
+      </w:pPr>
+      <w:r>
+        <w:t xml:space="preserve">The attack button takes the better of your </w:t>
+      </w:r>
+      <w:r>
+        <w:rPr>
+          <w:b/>
+          <w:bCs/>
+        </w:rPr>
+        <w:t xml:space="preserve">Driving Dunk</w:t>
+      </w:r>
+      <w:r>
+        <w:t xml:space="preserve"> (Standing Dunk right under the rim) and your </w:t>
+      </w:r>
+      <w:r>
+        <w:rPr>
+          <w:b/>
+          <w:bCs/>
+        </w:rPr>
+        <w:t xml:space="preserve">Layup</w:t>
+      </w:r>
+      <w:r>
+        <w:t xml:space="preserve">. It used to dunk whenever it could.</w:t>
+      </w:r>
+    </w:p>
+    <w:p>
+      <w:pPr>
+        <w:pStyle w:val="ListParagraph"/>
+        <w:numPr>
+          <w:ilvl w:val="1"/>
+          <w:numId w:val="2"/>
+        </w:numPr>
+      </w:pPr>
+      <w:r>
+        <w:t xml:space="preserve">Driving with the shoot button no longer gives the dunk a head start: the highest of Driving Dunk, Layup and a pull-up wins, adjusted for the defense.</w:t>
+      </w:r>
+    </w:p>
+    <w:p>
+      <w:pPr>
+        <w:pStyle w:val="ListParagraph"/>
+        <w:numPr>
+          <w:ilvl w:val="1"/>
+          <w:numId w:val="2"/>
+        </w:numPr>
+      </w:pPr>
+      <w:r>
+        <w:rPr>
+          <w:b/>
+          <w:bCs/>
+        </w:rPr>
+        <w:t xml:space="preserve">On an exact tie, your archetype decides:</w:t>
+      </w:r>
+      <w:r>
+        <w:t xml:space="preserve"> Slashers, Glass Cleaners and Post Scorers dunk; Playmakers, Sharpshooters, Stretch Bigs, Lockdowns and Two-Way players lay it in. A 99/99 Slasher dunks, and a 99/99 Playmaker lays it in.</w:t>
+      </w:r>
+    </w:p>
+    <w:p>
+      <w:pPr>
+        <w:pStyle w:val="ListParagraph"/>
+        <w:numPr>
+          <w:ilvl w:val="1"/>
+          <w:numId w:val="2"/>
+        </w:numPr>
+      </w:pPr>
+      <w:r>
+        <w:t xml:space="preserve">The AI follows the same rule, so it dunks less (in 40 test park games, 0.5 dunks a game instead of 1.4).</w:t>
+      </w:r>
+    </w:p>
+    <w:p>
+      <w:pPr>
         <w:pStyle w:val="Heading2"/>
       </w:pPr>
       <w:r>
@@ -1361,6 +1712,520 @@
       </w:r>
       <w:r>
         <w:t xml:space="preserve"> only go to teammates who can actually get there. Nobody flies in from half court any more.</w:t>
+      </w:r>
+    </w:p>
+    <w:p>
+      <w:pPr>
+        <w:pStyle w:val="Heading2"/>
+      </w:pPr>
+      <w:r>
+        <w:t xml:space="preserve">Controls (quick patch)</w:t>
+      </w:r>
+    </w:p>
+    <w:p>
+      <w:pPr>
+        <w:pStyle w:val="ListParagraph"/>
+        <w:numPr>
+          <w:ilvl w:val="0"/>
+          <w:numId w:val="2"/>
+        </w:numPr>
+      </w:pPr>
+      <w:r>
+        <w:rPr>
+          <w:b/>
+          <w:bCs/>
+        </w:rPr>
+        <w:t xml:space="preserve">The right stick is more responsive for dribble moves.</w:t>
+      </w:r>
+    </w:p>
+    <w:p>
+      <w:pPr>
+        <w:pStyle w:val="ListParagraph"/>
+        <w:numPr>
+          <w:ilvl w:val="1"/>
+          <w:numId w:val="2"/>
+        </w:numPr>
+      </w:pPr>
+      <w:r>
+        <w:t xml:space="preserve">Flicks register however fast your screen runs: 60, 120 or 144 Hz.</w:t>
+      </w:r>
+    </w:p>
+    <w:p>
+      <w:pPr>
+        <w:pStyle w:val="ListParagraph"/>
+        <w:numPr>
+          <w:ilvl w:val="1"/>
+          <w:numId w:val="2"/>
+        </w:numPr>
+      </w:pPr>
+      <w:r>
+        <w:t xml:space="preserve">On offense, every push out of the middle is a move. Sweeping straight from one side to the other works, and a spin needs a little less rotation.</w:t>
+      </w:r>
+    </w:p>
+    <w:p>
+      <w:pPr>
+        <w:pStyle w:val="ListParagraph"/>
+        <w:numPr>
+          <w:ilvl w:val="1"/>
+          <w:numId w:val="2"/>
+        </w:numPr>
+      </w:pPr>
+      <w:r>
+        <w:t xml:space="preserve">Every move works out of triple threat.</w:t>
+      </w:r>
+    </w:p>
+    <w:p>
+      <w:pPr>
+        <w:pStyle w:val="ListParagraph"/>
+        <w:numPr>
+          <w:ilvl w:val="1"/>
+          <w:numId w:val="2"/>
+        </w:numPr>
+      </w:pPr>
+      <w:r>
+        <w:t xml:space="preserve">An exhausted player still does the move you call, just slower.</w:t>
+      </w:r>
+    </w:p>
+    <w:p>
+      <w:pPr>
+        <w:pStyle w:val="ListParagraph"/>
+        <w:numPr>
+          <w:ilvl w:val="1"/>
+          <w:numId w:val="2"/>
+        </w:numPr>
+      </w:pPr>
+      <w:r>
+        <w:t xml:space="preserve">On defense, only a quick flick reaches, so holding a hand out won't foul.</w:t>
+      </w:r>
+    </w:p>
+    <w:p>
+      <w:pPr>
+        <w:pStyle w:val="ListParagraph"/>
+        <w:numPr>
+          <w:ilvl w:val="0"/>
+          <w:numId w:val="2"/>
+        </w:numPr>
+      </w:pPr>
+      <w:r>
+        <w:rPr>
+          <w:b/>
+          <w:bCs/>
+        </w:rPr>
+        <w:t xml:space="preserve">Snappy dribble moves:</w:t>
+      </w:r>
+    </w:p>
+    <w:p>
+      <w:pPr>
+        <w:pStyle w:val="ListParagraph"/>
+        <w:numPr>
+          <w:ilvl w:val="1"/>
+          <w:numId w:val="2"/>
+        </w:numPr>
+      </w:pPr>
+      <w:r>
+        <w:t xml:space="preserve">Every move comes out quicker, and quicker still with a better </w:t>
+      </w:r>
+      <w:r>
+        <w:rPr>
+          <w:b/>
+          <w:bCs/>
+        </w:rPr>
+        <w:t xml:space="preserve">Ball Handle</w:t>
+      </w:r>
+      <w:r>
+        <w:t xml:space="preserve"> and </w:t>
+      </w:r>
+      <w:r>
+        <w:rPr>
+          <w:b/>
+          <w:bCs/>
+        </w:rPr>
+        <w:t xml:space="preserve">Speed with Ball</w:t>
+      </w:r>
+      <w:r>
+        <w:t xml:space="preserve"> (and a faster size-up package).</w:t>
+      </w:r>
+    </w:p>
+    <w:tbl>
+      <w:tblPr>
+        <w:tblW w:type="dxa" w:w="9360"/>
+        <w:tblBorders>
+          <w:top w:val="single" w:color="auto" w:sz="4"/>
+          <w:left w:val="single" w:color="auto" w:sz="4"/>
+          <w:bottom w:val="single" w:color="auto" w:sz="4"/>
+          <w:right w:val="single" w:color="auto" w:sz="4"/>
+          <w:insideH w:val="single" w:color="auto" w:sz="4"/>
+          <w:insideV w:val="single" w:color="auto" w:sz="4"/>
+        </w:tblBorders>
+      </w:tblPr>
+      <w:tblGrid>
+        <w:gridCol w:w="3120"/>
+        <w:gridCol w:w="3120"/>
+        <w:gridCol w:w="3120"/>
+      </w:tblGrid>
+      <w:tr>
+        <w:trPr>
+          <w:tblHeader/>
+        </w:trPr>
+        <w:tc>
+          <w:tcPr>
+            <w:tcW w:type="dxa" w:w="3120"/>
+            <w:shd w:fill="DCE6F1" w:color="auto" w:val="clear"/>
+            <w:tcMar>
+              <w:top w:type="dxa" w:w="60"/>
+              <w:left w:type="dxa" w:w="100"/>
+              <w:bottom w:type="dxa" w:w="60"/>
+              <w:right w:type="dxa" w:w="100"/>
+            </w:tcMar>
+          </w:tcPr>
+          <w:p>
+            <w:r>
+              <w:rPr>
+                <w:b/>
+                <w:bCs/>
+              </w:rPr>
+              <w:t xml:space="preserve">Crossover</w:t>
+            </w:r>
+          </w:p>
+        </w:tc>
+        <w:tc>
+          <w:tcPr>
+            <w:tcW w:type="dxa" w:w="3120"/>
+            <w:shd w:fill="DCE6F1" w:color="auto" w:val="clear"/>
+            <w:tcMar>
+              <w:top w:type="dxa" w:w="60"/>
+              <w:left w:type="dxa" w:w="100"/>
+              <w:bottom w:type="dxa" w:w="60"/>
+              <w:right w:type="dxa" w:w="100"/>
+            </w:tcMar>
+          </w:tcPr>
+          <w:p>
+            <w:r>
+              <w:rPr>
+                <w:b/>
+                <w:bCs/>
+              </w:rPr>
+              <w:t xml:space="preserve">Before</w:t>
+            </w:r>
+          </w:p>
+        </w:tc>
+        <w:tc>
+          <w:tcPr>
+            <w:tcW w:type="dxa" w:w="3120"/>
+            <w:shd w:fill="DCE6F1" w:color="auto" w:val="clear"/>
+            <w:tcMar>
+              <w:top w:type="dxa" w:w="60"/>
+              <w:left w:type="dxa" w:w="100"/>
+              <w:bottom w:type="dxa" w:w="60"/>
+              <w:right w:type="dxa" w:w="100"/>
+            </w:tcMar>
+          </w:tcPr>
+          <w:p>
+            <w:r>
+              <w:rPr>
+                <w:b/>
+                <w:bCs/>
+              </w:rPr>
+              <w:t xml:space="preserve">Now</w:t>
+            </w:r>
+          </w:p>
+        </w:tc>
+      </w:tr>
+      <w:tr>
+        <w:trPr>
+          <w:tblHeader w:val="false"/>
+        </w:trPr>
+        <w:tc>
+          <w:tcPr>
+            <w:tcW w:type="dxa" w:w="3120"/>
+            <w:tcMar>
+              <w:top w:type="dxa" w:w="60"/>
+              <w:left w:type="dxa" w:w="100"/>
+              <w:bottom w:type="dxa" w:w="60"/>
+              <w:right w:type="dxa" w:w="100"/>
+            </w:tcMar>
+          </w:tcPr>
+          <w:p>
+            <w:r>
+              <w:t xml:space="preserve">55 Ball Handle / Speed with Ball, Basic size-up</w:t>
+            </w:r>
+          </w:p>
+        </w:tc>
+        <w:tc>
+          <w:tcPr>
+            <w:tcW w:type="dxa" w:w="3120"/>
+            <w:tcMar>
+              <w:top w:type="dxa" w:w="60"/>
+              <w:left w:type="dxa" w:w="100"/>
+              <w:bottom w:type="dxa" w:w="60"/>
+              <w:right w:type="dxa" w:w="100"/>
+            </w:tcMar>
+          </w:tcPr>
+          <w:p>
+            <w:r>
+              <w:t xml:space="preserve">400 ms</w:t>
+            </w:r>
+          </w:p>
+        </w:tc>
+        <w:tc>
+          <w:tcPr>
+            <w:tcW w:type="dxa" w:w="3120"/>
+            <w:tcMar>
+              <w:top w:type="dxa" w:w="60"/>
+              <w:left w:type="dxa" w:w="100"/>
+              <w:bottom w:type="dxa" w:w="60"/>
+              <w:right w:type="dxa" w:w="100"/>
+            </w:tcMar>
+          </w:tcPr>
+          <w:p>
+            <w:r>
+              <w:t xml:space="preserve">289 ms</w:t>
+            </w:r>
+          </w:p>
+        </w:tc>
+      </w:tr>
+      <w:tr>
+        <w:trPr>
+          <w:tblHeader w:val="false"/>
+        </w:trPr>
+        <w:tc>
+          <w:tcPr>
+            <w:tcW w:type="dxa" w:w="3120"/>
+            <w:tcMar>
+              <w:top w:type="dxa" w:w="60"/>
+              <w:left w:type="dxa" w:w="100"/>
+              <w:bottom w:type="dxa" w:w="60"/>
+              <w:right w:type="dxa" w:w="100"/>
+            </w:tcMar>
+          </w:tcPr>
+          <w:p>
+            <w:r>
+              <w:t xml:space="preserve">75 / 75, Basic</w:t>
+            </w:r>
+          </w:p>
+        </w:tc>
+        <w:tc>
+          <w:tcPr>
+            <w:tcW w:type="dxa" w:w="3120"/>
+            <w:tcMar>
+              <w:top w:type="dxa" w:w="60"/>
+              <w:left w:type="dxa" w:w="100"/>
+              <w:bottom w:type="dxa" w:w="60"/>
+              <w:right w:type="dxa" w:w="100"/>
+            </w:tcMar>
+          </w:tcPr>
+          <w:p>
+            <w:r>
+              <w:t xml:space="preserve">400 ms</w:t>
+            </w:r>
+          </w:p>
+        </w:tc>
+        <w:tc>
+          <w:tcPr>
+            <w:tcW w:type="dxa" w:w="3120"/>
+            <w:tcMar>
+              <w:top w:type="dxa" w:w="60"/>
+              <w:left w:type="dxa" w:w="100"/>
+              <w:bottom w:type="dxa" w:w="60"/>
+              <w:right w:type="dxa" w:w="100"/>
+            </w:tcMar>
+          </w:tcPr>
+          <w:p>
+            <w:r>
+              <w:t xml:space="preserve">263 ms</w:t>
+            </w:r>
+          </w:p>
+        </w:tc>
+      </w:tr>
+      <w:tr>
+        <w:trPr>
+          <w:tblHeader w:val="false"/>
+        </w:trPr>
+        <w:tc>
+          <w:tcPr>
+            <w:tcW w:type="dxa" w:w="3120"/>
+            <w:tcMar>
+              <w:top w:type="dxa" w:w="60"/>
+              <w:left w:type="dxa" w:w="100"/>
+              <w:bottom w:type="dxa" w:w="60"/>
+              <w:right w:type="dxa" w:w="100"/>
+            </w:tcMar>
+          </w:tcPr>
+          <w:p>
+            <w:r>
+              <w:t xml:space="preserve">90 / 85, Quick Handle</w:t>
+            </w:r>
+          </w:p>
+        </w:tc>
+        <w:tc>
+          <w:tcPr>
+            <w:tcW w:type="dxa" w:w="3120"/>
+            <w:tcMar>
+              <w:top w:type="dxa" w:w="60"/>
+              <w:left w:type="dxa" w:w="100"/>
+              <w:bottom w:type="dxa" w:w="60"/>
+              <w:right w:type="dxa" w:w="100"/>
+            </w:tcMar>
+          </w:tcPr>
+          <w:p>
+            <w:r>
+              <w:t xml:space="preserve">357 ms</w:t>
+            </w:r>
+          </w:p>
+        </w:tc>
+        <w:tc>
+          <w:tcPr>
+            <w:tcW w:type="dxa" w:w="3120"/>
+            <w:tcMar>
+              <w:top w:type="dxa" w:w="60"/>
+              <w:left w:type="dxa" w:w="100"/>
+              <w:bottom w:type="dxa" w:w="60"/>
+              <w:right w:type="dxa" w:w="100"/>
+            </w:tcMar>
+          </w:tcPr>
+          <w:p>
+            <w:r>
+              <w:t xml:space="preserve">224 ms</w:t>
+            </w:r>
+          </w:p>
+        </w:tc>
+      </w:tr>
+      <w:tr>
+        <w:trPr>
+          <w:tblHeader w:val="false"/>
+        </w:trPr>
+        <w:tc>
+          <w:tcPr>
+            <w:tcW w:type="dxa" w:w="3120"/>
+            <w:tcMar>
+              <w:top w:type="dxa" w:w="60"/>
+              <w:left w:type="dxa" w:w="100"/>
+              <w:bottom w:type="dxa" w:w="60"/>
+              <w:right w:type="dxa" w:w="100"/>
+            </w:tcMar>
+          </w:tcPr>
+          <w:p>
+            <w:r>
+              <w:t xml:space="preserve">99 / 99, Elite Handle</w:t>
+            </w:r>
+          </w:p>
+        </w:tc>
+        <w:tc>
+          <w:tcPr>
+            <w:tcW w:type="dxa" w:w="3120"/>
+            <w:tcMar>
+              <w:top w:type="dxa" w:w="60"/>
+              <w:left w:type="dxa" w:w="100"/>
+              <w:bottom w:type="dxa" w:w="60"/>
+              <w:right w:type="dxa" w:w="100"/>
+            </w:tcMar>
+          </w:tcPr>
+          <w:p>
+            <w:r>
+              <w:t xml:space="preserve">328 ms</w:t>
+            </w:r>
+          </w:p>
+        </w:tc>
+        <w:tc>
+          <w:tcPr>
+            <w:tcW w:type="dxa" w:w="3120"/>
+            <w:tcMar>
+              <w:top w:type="dxa" w:w="60"/>
+              <w:left w:type="dxa" w:w="100"/>
+              <w:bottom w:type="dxa" w:w="60"/>
+              <w:right w:type="dxa" w:w="100"/>
+            </w:tcMar>
+          </w:tcPr>
+          <w:p>
+            <w:r>
+              <w:t xml:space="preserve">190 ms</w:t>
+            </w:r>
+          </w:p>
+        </w:tc>
+      </w:tr>
+    </w:tbl>
+    <w:p>
+      <w:pPr>
+        <w:spacing w:after="60"/>
+      </w:pPr>
+    </w:p>
+    <w:p>
+      <w:pPr>
+        <w:pStyle w:val="ListParagraph"/>
+        <w:numPr>
+          <w:ilvl w:val="1"/>
+          <w:numId w:val="2"/>
+        </w:numPr>
+      </w:pPr>
+      <w:r>
+        <w:rPr>
+          <w:b/>
+          <w:bCs/>
+        </w:rPr>
+        <w:t xml:space="preserve">Moves come one after the other.</w:t>
+      </w:r>
+      <w:r>
+        <w:t xml:space="preserve"> Call the next move and it cuts in once the current one is 60% done, so you can string them together.</w:t>
+      </w:r>
+    </w:p>
+    <w:p>
+      <w:pPr>
+        <w:pStyle w:val="ListParagraph"/>
+        <w:numPr>
+          <w:ilvl w:val="1"/>
+          <w:numId w:val="2"/>
+        </w:numPr>
+      </w:pPr>
+      <w:r>
+        <w:rPr>
+          <w:b/>
+          <w:bCs/>
+        </w:rPr>
+        <w:t xml:space="preserve">Combos are rewarded.</w:t>
+      </w:r>
+      <w:r>
+        <w:t xml:space="preserve"> A different move right after the last one costs </w:t>
+      </w:r>
+      <w:r>
+        <w:rPr>
+          <w:b/>
+          <w:bCs/>
+        </w:rPr>
+        <w:t xml:space="preserve">no stamina</w:t>
+      </w:r>
+      <w:r>
+        <w:t xml:space="preserve">, and each step of a combo adds a little to the ankle-breaker chance.</w:t>
+      </w:r>
+    </w:p>
+    <w:p>
+      <w:pPr>
+        <w:pStyle w:val="ListParagraph"/>
+        <w:numPr>
+          <w:ilvl w:val="1"/>
+          <w:numId w:val="2"/>
+        </w:numPr>
+      </w:pPr>
+      <w:r>
+        <w:rPr>
+          <w:b/>
+          <w:bCs/>
+        </w:rPr>
+        <w:t xml:space="preserve">Spamming isn't.</w:t>
+      </w:r>
+      <w:r>
+        <w:t xml:space="preserve"> The same move again still costs stamina every time, and the drain still doubles after three in a row.</w:t>
+      </w:r>
+    </w:p>
+    <w:p>
+      <w:pPr>
+        <w:pStyle w:val="ListParagraph"/>
+        <w:numPr>
+          <w:ilvl w:val="1"/>
+          <w:numId w:val="2"/>
+        </w:numPr>
+      </w:pPr>
+      <w:r>
+        <w:t xml:space="preserve">To keep the balance, the base ankle-breaker chance is a little lower. Over 40 test games, field-goal percentage was unchanged (38.4% → 38.3%) and ankle-breakers went from 6.0 to 6.75 a game.</w:t>
       </w:r>
     </w:p>
     <w:p>

</xml_diff>

<commit_message>
(final) quick patch #2 for v0.4.5
</commit_message>
<xml_diff>
--- a/PATCH_NOTES_v0.4.5.docx
+++ b/PATCH_NOTES_v0.4.5.docx
@@ -592,6 +592,25 @@
       <w:pPr>
         <w:pStyle w:val="ListParagraph"/>
         <w:numPr>
+          <w:ilvl w:val="1"/>
+          <w:numId w:val="2"/>
+        </w:numPr>
+      </w:pPr>
+      <w:r>
+        <w:rPr>
+          <w:b/>
+          <w:bCs/>
+        </w:rPr>
+        <w:t xml:space="preserve">Fixed:</w:t>
+      </w:r>
+      <w:r>
+        <w:t xml:space="preserve"> your streak now lights up the court you're stepping onto right away. It used to wait for the tip-off, and could light up the last court you played on instead. Kings who beat you now show their real streak, not one left over from an earlier group.</w:t>
+      </w:r>
+    </w:p>
+    <w:p>
+      <w:pPr>
+        <w:pStyle w:val="ListParagraph"/>
+        <w:numPr>
           <w:ilvl w:val="0"/>
           <w:numId w:val="2"/>
         </w:numPr>
@@ -637,6 +656,183 @@
           <w:b/>
           <w:bCs/>
         </w:rPr>
+        <w:t xml:space="preserve">Timing is everything</w:t>
+      </w:r>
+      <w:r>
+        <w:t xml:space="preserve"> (quick patch):</w:t>
+      </w:r>
+    </w:p>
+    <w:p>
+      <w:pPr>
+        <w:pStyle w:val="ListParagraph"/>
+        <w:numPr>
+          <w:ilvl w:val="1"/>
+          <w:numId w:val="2"/>
+        </w:numPr>
+      </w:pPr>
+      <w:r>
+        <w:t xml:space="preserve">A jumper, free throw or layup let go </w:t>
+      </w:r>
+      <w:r>
+        <w:rPr>
+          <w:b/>
+          <w:bCs/>
+        </w:rPr>
+        <w:t xml:space="preserve">outside the green window very rarely goes in</w:t>
+      </w:r>
+      <w:r>
+        <w:t xml:space="preserve">: 3% at most if it's slightly early or late, half a percent if it's way off. That holds for every rating, badge and hot hand.</w:t>
+      </w:r>
+    </w:p>
+    <w:p>
+      <w:pPr>
+        <w:pStyle w:val="ListParagraph"/>
+        <w:numPr>
+          <w:ilvl w:val="1"/>
+          <w:numId w:val="2"/>
+        </w:numPr>
+      </w:pPr>
+      <w:r>
+        <w:rPr>
+          <w:b/>
+          <w:bCs/>
+        </w:rPr>
+        <w:t xml:space="preserve">Every green window is another 6.5% smaller.</w:t>
+      </w:r>
+    </w:p>
+    <w:p>
+      <w:pPr>
+        <w:pStyle w:val="ListParagraph"/>
+        <w:numPr>
+          <w:ilvl w:val="1"/>
+          <w:numId w:val="2"/>
+        </w:numPr>
+      </w:pPr>
+      <w:r>
+        <w:rPr>
+          <w:b/>
+          <w:bCs/>
+        </w:rPr>
+        <w:t xml:space="preserve">The contest bites harder:</w:t>
+      </w:r>
+      <w:r>
+        <w:t xml:space="preserve"> in every guarded tier (Open, Light contest, Contested) the defense takes 5% more off your green window. Wide-open looks are untouched.</w:t>
+      </w:r>
+    </w:p>
+    <w:p>
+      <w:pPr>
+        <w:pStyle w:val="ListParagraph"/>
+        <w:numPr>
+          <w:ilvl w:val="1"/>
+          <w:numId w:val="2"/>
+        </w:numPr>
+      </w:pPr>
+      <w:r>
+        <w:rPr>
+          <w:b/>
+          <w:bCs/>
+        </w:rPr>
+        <w:t xml:space="preserve">The middle of the green window is the moment the ball leaves your player's hand</w:t>
+      </w:r>
+      <w:r>
+        <w:t xml:space="preserve">, for every jump-shot base, release, layup package and build. The ball no longer floats up out of the hand of long-armed players before the release.</w:t>
+      </w:r>
+    </w:p>
+    <w:p>
+      <w:pPr>
+        <w:pStyle w:val="ListParagraph"/>
+        <w:numPr>
+          <w:ilvl w:val="0"/>
+          <w:numId w:val="2"/>
+        </w:numPr>
+      </w:pPr>
+      <w:r>
+        <w:rPr>
+          <w:b/>
+          <w:bCs/>
+        </w:rPr>
+        <w:t xml:space="preserve">Stats under 70 aren't proficient</w:t>
+      </w:r>
+      <w:r>
+        <w:t xml:space="preserve"> (quick patch):</w:t>
+      </w:r>
+    </w:p>
+    <w:p>
+      <w:pPr>
+        <w:pStyle w:val="ListParagraph"/>
+        <w:numPr>
+          <w:ilvl w:val="1"/>
+          <w:numId w:val="2"/>
+        </w:numPr>
+      </w:pPr>
+      <w:r>
+        <w:t xml:space="preserve">Any stat under 70 plays </w:t>
+      </w:r>
+      <w:r>
+        <w:rPr>
+          <w:b/>
+          <w:bCs/>
+        </w:rPr>
+        <w:t xml:space="preserve">10% less effective</w:t>
+      </w:r>
+      <w:r>
+        <w:t xml:space="preserve">, across the board: shooting, finishing, handles, passing, defense, rebounding, speed, vertical, strength and stamina.</w:t>
+      </w:r>
+    </w:p>
+    <w:p>
+      <w:pPr>
+        <w:pStyle w:val="ListParagraph"/>
+        <w:numPr>
+          <w:ilvl w:val="1"/>
+          <w:numId w:val="2"/>
+        </w:numPr>
+      </w:pPr>
+      <w:r>
+        <w:t xml:space="preserve">A shooting stat under 70 also gets a </w:t>
+      </w:r>
+      <w:r>
+        <w:rPr>
+          <w:b/>
+          <w:bCs/>
+        </w:rPr>
+        <w:t xml:space="preserve">10% smaller green window</w:t>
+      </w:r>
+      <w:r>
+        <w:t xml:space="preserve"> for that shot.</w:t>
+      </w:r>
+    </w:p>
+    <w:p>
+      <w:pPr>
+        <w:pStyle w:val="ListParagraph"/>
+        <w:numPr>
+          <w:ilvl w:val="0"/>
+          <w:numId w:val="2"/>
+        </w:numPr>
+      </w:pPr>
+      <w:r>
+        <w:rPr>
+          <w:b/>
+          <w:bCs/>
+        </w:rPr>
+        <w:t xml:space="preserve">Shot feedback shows how guarded you were</w:t>
+      </w:r>
+      <w:r>
+        <w:t xml:space="preserve"> (quick patch): "62% guarded · Contested". It's the exact contest your release was graded with: the defenders' positions and angle, hands up, their length and defensive ratings, and help defense.</w:t>
+      </w:r>
+    </w:p>
+    <w:p>
+      <w:pPr>
+        <w:pStyle w:val="ListParagraph"/>
+        <w:numPr>
+          <w:ilvl w:val="0"/>
+          <w:numId w:val="2"/>
+        </w:numPr>
+      </w:pPr>
+      <w:r>
+        <w:rPr>
+          <w:b/>
+          <w:bCs/>
+        </w:rPr>
         <w:t xml:space="preserve">A new shot meter</w:t>
       </w:r>
       <w:r>
@@ -1434,7 +1630,36 @@
         <w:t xml:space="preserve">0.75%</w:t>
       </w:r>
       <w:r>
-        <w:t xml:space="preserve"> in the final touches.</w:t>
+        <w:t xml:space="preserve"> in the final touches, and </w:t>
+      </w:r>
+      <w:r>
+        <w:rPr>
+          <w:b/>
+          <w:bCs/>
+        </w:rPr>
+        <w:t xml:space="preserve">3.75%</w:t>
+      </w:r>
+      <w:r>
+        <w:t xml:space="preserve"> more in the quick patch.</w:t>
+      </w:r>
+    </w:p>
+    <w:p>
+      <w:pPr>
+        <w:pStyle w:val="ListParagraph"/>
+        <w:numPr>
+          <w:ilvl w:val="0"/>
+          <w:numId w:val="2"/>
+        </w:numPr>
+      </w:pPr>
+      <w:r>
+        <w:rPr>
+          <w:b/>
+          <w:bCs/>
+        </w:rPr>
+        <w:t xml:space="preserve">Dribbling is 7.45% slower</w:t>
+      </w:r>
+      <w:r>
+        <w:t xml:space="preserve"> (quick patch): everyone moves 7.45% slower with the ball. Dribble moves come out just as quickly.</w:t>
       </w:r>
     </w:p>
     <w:p>
@@ -1528,6 +1753,25 @@
           <w:b/>
           <w:bCs/>
         </w:rPr>
+        <w:t xml:space="preserve">Dunks keep the game moving</w:t>
+      </w:r>
+      <w:r>
+        <w:t xml:space="preserve"> (quick patch): no more slow motion on slams. Instead every dunk is thrown straight down through the rim, hard, with an emphatic follow-through, a bigger rim shake and camera kick.</w:t>
+      </w:r>
+    </w:p>
+    <w:p>
+      <w:pPr>
+        <w:pStyle w:val="ListParagraph"/>
+        <w:numPr>
+          <w:ilvl w:val="0"/>
+          <w:numId w:val="2"/>
+        </w:numPr>
+      </w:pPr>
+      <w:r>
+        <w:rPr>
+          <w:b/>
+          <w:bCs/>
+        </w:rPr>
         <w:t xml:space="preserve">Finishing follows your best rating</w:t>
       </w:r>
       <w:r>
@@ -1649,6 +1893,73 @@
           <w:b/>
           <w:bCs/>
         </w:rPr>
+        <w:t xml:space="preserve">And smarter again in the quick patch</w:t>
+      </w:r>
+      <w:r>
+        <w:t xml:space="preserve">, the best players most:</w:t>
+      </w:r>
+    </w:p>
+    <w:p>
+      <w:pPr>
+        <w:pStyle w:val="ListParagraph"/>
+        <w:numPr>
+          <w:ilvl w:val="1"/>
+          <w:numId w:val="2"/>
+        </w:numPr>
+      </w:pPr>
+      <w:r>
+        <w:t xml:space="preserve">They pass up shots that are about to be smothered and take better ones.</w:t>
+      </w:r>
+    </w:p>
+    <w:p>
+      <w:pPr>
+        <w:pStyle w:val="ListParagraph"/>
+        <w:numPr>
+          <w:ilvl w:val="1"/>
+          <w:numId w:val="2"/>
+        </w:numPr>
+      </w:pPr>
+      <w:r>
+        <w:t xml:space="preserve">They mix their dribble moves up instead of repeating the same one, and string combos together.</w:t>
+      </w:r>
+    </w:p>
+    <w:p>
+      <w:pPr>
+        <w:pStyle w:val="ListParagraph"/>
+        <w:numPr>
+          <w:ilvl w:val="1"/>
+          <w:numId w:val="2"/>
+        </w:numPr>
+      </w:pPr>
+      <w:r>
+        <w:t xml:space="preserve">They play the stamina and takeover systems: feeding a teammate in a takeover or on fire, looking for their own shot when they're rolling, not forcing drives on tired legs, and crowding a hot shooter on defense.</w:t>
+      </w:r>
+    </w:p>
+    <w:p>
+      <w:pPr>
+        <w:pStyle w:val="ListParagraph"/>
+        <w:numPr>
+          <w:ilvl w:val="1"/>
+          <w:numId w:val="2"/>
+        </w:numPr>
+      </w:pPr>
+      <w:r>
+        <w:t xml:space="preserve">Their timing was recalibrated to the new rules, so AI shooting percentages stay about where they were.</w:t>
+      </w:r>
+    </w:p>
+    <w:p>
+      <w:pPr>
+        <w:pStyle w:val="ListParagraph"/>
+        <w:numPr>
+          <w:ilvl w:val="0"/>
+          <w:numId w:val="2"/>
+        </w:numPr>
+      </w:pPr>
+      <w:r>
+        <w:rPr>
+          <w:b/>
+          <w:bCs/>
+        </w:rPr>
         <w:t xml:space="preserve">After an ankle-breaker:</w:t>
       </w:r>
     </w:p>
@@ -1811,6 +2122,25 @@
           <w:b/>
           <w:bCs/>
         </w:rPr>
+        <w:t xml:space="preserve">Icon passing shows the inputs over your teammates' heads</w:t>
+      </w:r>
+      <w:r>
+        <w:t xml:space="preserve"> for whatever you're playing with: the key on a keyboard, or LB plus the face button on a controller, in your controller's own symbols.</w:t>
+      </w:r>
+    </w:p>
+    <w:p>
+      <w:pPr>
+        <w:pStyle w:val="ListParagraph"/>
+        <w:numPr>
+          <w:ilvl w:val="0"/>
+          <w:numId w:val="2"/>
+        </w:numPr>
+      </w:pPr>
+      <w:r>
+        <w:rPr>
+          <w:b/>
+          <w:bCs/>
+        </w:rPr>
         <w:t xml:space="preserve">Snappy dribble moves:</w:t>
       </w:r>
     </w:p>
@@ -1843,7 +2173,7 @@
         <w:t xml:space="preserve">Speed with Ball</w:t>
       </w:r>
       <w:r>
-        <w:t xml:space="preserve"> (and a faster size-up package).</w:t>
+        <w:t xml:space="preserve"> (and a faster size-up package). The table is for a point guard, with everything below included (wings are 5% slower, bigs 10%).</w:t>
       </w:r>
     </w:p>
     <w:tbl>
@@ -1979,7 +2309,7 @@
           </w:tcPr>
           <w:p>
             <w:r>
-              <w:t xml:space="preserve">289 ms</w:t>
+              <w:t xml:space="preserve">304 ms</w:t>
             </w:r>
           </w:p>
         </w:tc>
@@ -2032,7 +2362,7 @@
           </w:tcPr>
           <w:p>
             <w:r>
-              <w:t xml:space="preserve">263 ms</w:t>
+              <w:t xml:space="preserve">277 ms</w:t>
             </w:r>
           </w:p>
         </w:tc>
@@ -2085,7 +2415,7 @@
           </w:tcPr>
           <w:p>
             <w:r>
-              <w:t xml:space="preserve">224 ms</w:t>
+              <w:t xml:space="preserve">236 ms</w:t>
             </w:r>
           </w:p>
         </w:tc>
@@ -2138,7 +2468,7 @@
           </w:tcPr>
           <w:p>
             <w:r>
-              <w:t xml:space="preserve">190 ms</w:t>
+              <w:t xml:space="preserve">200 ms</w:t>
             </w:r>
           </w:p>
         </w:tc>
@@ -2214,6 +2544,44 @@
       </w:r>
       <w:r>
         <w:t xml:space="preserve"> The same move again still costs stamina every time, and the drain still doubles after three in a row.</w:t>
+      </w:r>
+    </w:p>
+    <w:p>
+      <w:pPr>
+        <w:pStyle w:val="ListParagraph"/>
+        <w:numPr>
+          <w:ilvl w:val="1"/>
+          <w:numId w:val="2"/>
+        </w:numPr>
+      </w:pPr>
+      <w:r>
+        <w:rPr>
+          <w:b/>
+          <w:bCs/>
+        </w:rPr>
+        <w:t xml:space="preserve">Bigs are a step slower:</w:t>
+      </w:r>
+      <w:r>
+        <w:t xml:space="preserve"> PF and C dribble moves come out 10% slower, SF and SG moves 5% slower. Point guards' are unchanged.</w:t>
+      </w:r>
+    </w:p>
+    <w:p>
+      <w:pPr>
+        <w:pStyle w:val="ListParagraph"/>
+        <w:numPr>
+          <w:ilvl w:val="1"/>
+          <w:numId w:val="2"/>
+        </w:numPr>
+      </w:pPr>
+      <w:r>
+        <w:rPr>
+          <w:b/>
+          <w:bCs/>
+        </w:rPr>
+        <w:t xml:space="preserve">And every dribble move is 5% slower</w:t>
+      </w:r>
+      <w:r>
+        <w:t xml:space="preserve"> for everyone, on top of that. With 75 Ball Handle and Speed with Ball on the Basic size-up, a crossover takes 277 ms for a PG, 292 ms for an SG or SF and 308 ms for a PF or C.</w:t>
       </w:r>
     </w:p>
     <w:p>

</xml_diff>